<commit_message>
CORRECTION : correction Algo de Recherche
</commit_message>
<xml_diff>
--- a/08-Algorithme_Trie.docx
+++ b/08-Algorithme_Trie.docx
@@ -1359,7 +1359,6 @@
         </w:rPr>
       </w:pPr>
       <w:proofErr w:type="spellStart"/>
-      <w:proofErr w:type="gramStart"/>
       <w:r>
         <w:rPr>
           <w:b/>
@@ -1368,7 +1367,6 @@
         <w:t>indexMin</w:t>
       </w:r>
       <w:proofErr w:type="spellEnd"/>
-      <w:proofErr w:type="gramEnd"/>
       <w:r>
         <w:rPr>
           <w:b/>
@@ -1563,30 +1561,12 @@
         <w:jc w:val="both"/>
       </w:pPr>
       <w:proofErr w:type="spellStart"/>
-      <w:proofErr w:type="gramStart"/>
       <w:r>
         <w:t>indexMin</w:t>
       </w:r>
       <w:proofErr w:type="spellEnd"/>
-      <w:proofErr w:type="gramEnd"/>
-      <w:r>
-        <w:t xml:space="preserve"> est différent de </w:t>
-      </w:r>
-      <w:proofErr w:type="gramStart"/>
-      <w:r>
-        <w:t>i  (</w:t>
-      </w:r>
-      <w:proofErr w:type="gramEnd"/>
-      <w:r>
-        <w:t xml:space="preserve"> 1</w:t>
-      </w:r>
-      <w:proofErr w:type="gramStart"/>
-      <w:r>
-        <w:t> !=</w:t>
-      </w:r>
-      <w:proofErr w:type="gramEnd"/>
-      <w:r>
-        <w:t xml:space="preserve"> 0) =&gt; Echange de valeur entre les case</w:t>
+      <w:r>
+        <w:t xml:space="preserve"> est différent de i  ( 1 != 0) =&gt; Echange de valeur entre les case</w:t>
       </w:r>
       <w:r>
         <w:t>s</w:t>
@@ -1601,14 +1581,7 @@
           <w:b/>
           <w:bCs/>
         </w:rPr>
-        <w:t xml:space="preserve">Fin boucle </w:t>
-      </w:r>
-      <w:r>
-        <w:rPr>
-          <w:b/>
-          <w:bCs/>
-        </w:rPr>
-        <w:t>i</w:t>
+        <w:t>Fin boucle i</w:t>
       </w:r>
     </w:p>
     <w:p>
@@ -1679,28 +1652,7 @@
           <w:b/>
           <w:bCs/>
         </w:rPr>
-        <w:t xml:space="preserve">PASSAGE </w:t>
-      </w:r>
-      <w:r>
-        <w:rPr>
-          <w:b/>
-          <w:bCs/>
-        </w:rPr>
-        <w:t>2</w:t>
-      </w:r>
-      <w:r>
-        <w:rPr>
-          <w:b/>
-          <w:bCs/>
-        </w:rPr>
-        <w:t xml:space="preserve"> : i = </w:t>
-      </w:r>
-      <w:r>
-        <w:rPr>
-          <w:b/>
-          <w:bCs/>
-        </w:rPr>
-        <w:t>1</w:t>
+        <w:t>PASSAGE 2 : i = 1</w:t>
       </w:r>
     </w:p>
     <w:p>
@@ -1712,7 +1664,6 @@
         </w:rPr>
       </w:pPr>
       <w:proofErr w:type="spellStart"/>
-      <w:proofErr w:type="gramStart"/>
       <w:r>
         <w:rPr>
           <w:b/>
@@ -1721,20 +1672,12 @@
         <w:t>indexMin</w:t>
       </w:r>
       <w:proofErr w:type="spellEnd"/>
-      <w:proofErr w:type="gramEnd"/>
-      <w:r>
-        <w:rPr>
-          <w:b/>
-          <w:bCs/>
-        </w:rPr>
-        <w:t xml:space="preserve"> = </w:t>
-      </w:r>
-      <w:r>
-        <w:rPr>
-          <w:b/>
-          <w:bCs/>
-        </w:rPr>
-        <w:t>1</w:t>
+      <w:r>
+        <w:rPr>
+          <w:b/>
+          <w:bCs/>
+        </w:rPr>
+        <w:t xml:space="preserve"> = 1</w:t>
       </w:r>
     </w:p>
     <w:p>
@@ -1746,21 +1689,7 @@
           <w:b/>
           <w:bCs/>
         </w:rPr>
-        <w:t xml:space="preserve">Tour 1 : j = </w:t>
-      </w:r>
-      <w:r>
-        <w:rPr>
-          <w:b/>
-          <w:bCs/>
-        </w:rPr>
-        <w:t>2</w:t>
-      </w:r>
-      <w:r>
-        <w:rPr>
-          <w:b/>
-          <w:bCs/>
-        </w:rPr>
-        <w:t xml:space="preserve"> </w:t>
+        <w:t xml:space="preserve">Tour 1 : j = 2 </w:t>
       </w:r>
       <w:r>
         <w:t xml:space="preserve">-&gt; comparer </w:t>
@@ -1771,25 +1700,7 @@
       </w:r>
       <w:proofErr w:type="spellEnd"/>
       <w:r>
-        <w:t xml:space="preserve"> </w:t>
-      </w:r>
-      <w:r>
-        <w:t>1</w:t>
-      </w:r>
-      <w:r>
-        <w:t xml:space="preserve"> à index j </w:t>
-      </w:r>
-      <w:r>
-        <w:t>2</w:t>
-      </w:r>
-      <w:r>
-        <w:t xml:space="preserve"> (valeur 29 et 1</w:t>
-      </w:r>
-      <w:r>
-        <w:t>4</w:t>
-      </w:r>
-      <w:r>
-        <w:t xml:space="preserve">) -&gt; </w:t>
+        <w:t xml:space="preserve"> 1 à index j 2 (valeur 29 et 14) -&gt; </w:t>
       </w:r>
       <w:proofErr w:type="spellStart"/>
       <w:r>
@@ -1797,13 +1708,7 @@
       </w:r>
       <w:proofErr w:type="spellEnd"/>
       <w:r>
-        <w:t xml:space="preserve"> = j (</w:t>
-      </w:r>
-      <w:r>
-        <w:t>2</w:t>
-      </w:r>
-      <w:r>
-        <w:t>)</w:t>
+        <w:t xml:space="preserve"> = j (2)</w:t>
       </w:r>
     </w:p>
     <w:p>
@@ -1824,14 +1729,7 @@
           <w:b/>
           <w:bCs/>
         </w:rPr>
-        <w:t xml:space="preserve"> 2 : j = </w:t>
-      </w:r>
-      <w:r>
-        <w:rPr>
-          <w:b/>
-          <w:bCs/>
-        </w:rPr>
-        <w:t>3</w:t>
+        <w:t xml:space="preserve"> 2 : j = 3</w:t>
       </w:r>
       <w:r>
         <w:t xml:space="preserve"> -&gt; comparer </w:t>
@@ -1842,31 +1740,7 @@
       </w:r>
       <w:proofErr w:type="spellEnd"/>
       <w:r>
-        <w:t xml:space="preserve"> </w:t>
-      </w:r>
-      <w:r>
-        <w:t>2</w:t>
-      </w:r>
-      <w:r>
-        <w:t xml:space="preserve"> à index j </w:t>
-      </w:r>
-      <w:r>
-        <w:t>3</w:t>
-      </w:r>
-      <w:r>
-        <w:t xml:space="preserve"> (valeur 1</w:t>
-      </w:r>
-      <w:r>
-        <w:t>4</w:t>
-      </w:r>
-      <w:r>
-        <w:t xml:space="preserve"> et </w:t>
-      </w:r>
-      <w:r>
-        <w:t>37</w:t>
-      </w:r>
-      <w:r>
-        <w:t xml:space="preserve">) -&gt; </w:t>
+        <w:t xml:space="preserve"> 2 à index j 3 (valeur 14 et 37) -&gt; </w:t>
       </w:r>
       <w:proofErr w:type="spellStart"/>
       <w:r>
@@ -1874,10 +1748,7 @@
       </w:r>
       <w:proofErr w:type="spellEnd"/>
       <w:r>
-        <w:t xml:space="preserve"> = </w:t>
-      </w:r>
-      <w:r>
-        <w:t>2</w:t>
+        <w:t xml:space="preserve"> = 2</w:t>
       </w:r>
     </w:p>
     <w:p>
@@ -1889,14 +1760,7 @@
           <w:b/>
           <w:bCs/>
         </w:rPr>
-        <w:t xml:space="preserve">Tour 3 : j = </w:t>
-      </w:r>
-      <w:r>
-        <w:rPr>
-          <w:b/>
-          <w:bCs/>
-        </w:rPr>
-        <w:t>4</w:t>
+        <w:t>Tour 3 : j = 4</w:t>
       </w:r>
       <w:r>
         <w:t xml:space="preserve"> -&gt; comparer </w:t>
@@ -1907,31 +1771,7 @@
       </w:r>
       <w:proofErr w:type="spellEnd"/>
       <w:r>
-        <w:t xml:space="preserve"> </w:t>
-      </w:r>
-      <w:r>
-        <w:t>2</w:t>
-      </w:r>
-      <w:r>
-        <w:t xml:space="preserve"> à index j </w:t>
-      </w:r>
-      <w:r>
-        <w:t>4</w:t>
-      </w:r>
-      <w:r>
-        <w:t xml:space="preserve"> (valeur 1</w:t>
-      </w:r>
-      <w:r>
-        <w:t>4</w:t>
-      </w:r>
-      <w:r>
-        <w:t xml:space="preserve"> et </w:t>
-      </w:r>
-      <w:r>
-        <w:t>13</w:t>
-      </w:r>
-      <w:r>
-        <w:t xml:space="preserve">) -&gt; </w:t>
+        <w:t xml:space="preserve"> 2 à index j 4 (valeur 14 et 13) -&gt; </w:t>
       </w:r>
       <w:proofErr w:type="spellStart"/>
       <w:r>
@@ -1939,10 +1779,7 @@
       </w:r>
       <w:proofErr w:type="spellEnd"/>
       <w:r>
-        <w:t xml:space="preserve"> = </w:t>
-      </w:r>
-      <w:r>
-        <w:t>4</w:t>
+        <w:t xml:space="preserve"> = 4</w:t>
       </w:r>
     </w:p>
     <w:p>
@@ -1958,21 +1795,7 @@
           <w:b/>
           <w:bCs/>
         </w:rPr>
-        <w:t xml:space="preserve">Tour 4 : j = </w:t>
-      </w:r>
-      <w:r>
-        <w:rPr>
-          <w:b/>
-          <w:bCs/>
-        </w:rPr>
-        <w:t>5</w:t>
-      </w:r>
-      <w:r>
-        <w:rPr>
-          <w:b/>
-          <w:bCs/>
-        </w:rPr>
-        <w:t xml:space="preserve"> </w:t>
+        <w:t xml:space="preserve">Tour 4 : j = 5 </w:t>
       </w:r>
       <w:r>
         <w:t xml:space="preserve">-&gt; comparer </w:t>
@@ -1983,42 +1806,15 @@
       </w:r>
       <w:proofErr w:type="spellEnd"/>
       <w:r>
-        <w:t xml:space="preserve"> </w:t>
-      </w:r>
-      <w:r>
-        <w:t>4</w:t>
-      </w:r>
-      <w:r>
-        <w:t xml:space="preserve"> à index j </w:t>
-      </w:r>
-      <w:r>
-        <w:t>5</w:t>
-      </w:r>
-      <w:r>
-        <w:t xml:space="preserve"> (valeur 1</w:t>
-      </w:r>
-      <w:r>
-        <w:t>3</w:t>
-      </w:r>
-      <w:r>
-        <w:t xml:space="preserve"> et </w:t>
-      </w:r>
-      <w:r>
-        <w:t>25</w:t>
-      </w:r>
-      <w:r>
-        <w:t>) -&gt; indexM</w:t>
+        <w:t xml:space="preserve"> 4 à index j 5 (valeur 13 et 25) -&gt; </w:t>
       </w:r>
       <w:proofErr w:type="spellStart"/>
       <w:r>
-        <w:t>in</w:t>
+        <w:t>indexMin</w:t>
       </w:r>
       <w:proofErr w:type="spellEnd"/>
       <w:r>
-        <w:t xml:space="preserve"> = </w:t>
-      </w:r>
-      <w:r>
-        <w:t xml:space="preserve">4 </w:t>
+        <w:t xml:space="preserve"> = 4 </w:t>
       </w:r>
       <w:r>
         <w:rPr>
@@ -2033,12 +1829,10 @@
         <w:jc w:val="both"/>
       </w:pPr>
       <w:proofErr w:type="spellStart"/>
-      <w:proofErr w:type="gramStart"/>
       <w:r>
         <w:t>indexMin</w:t>
       </w:r>
       <w:proofErr w:type="spellEnd"/>
-      <w:proofErr w:type="gramEnd"/>
       <w:r>
         <w:t xml:space="preserve"> est différent de i (4 != 1) =&gt; Echange de valeur entre les cases</w:t>
       </w:r>
@@ -2133,304 +1927,161 @@
           <w:b/>
           <w:bCs/>
         </w:rPr>
-        <w:t xml:space="preserve">PASSAGE </w:t>
-      </w:r>
-      <w:r>
-        <w:rPr>
-          <w:b/>
-          <w:bCs/>
-        </w:rPr>
-        <w:t>3</w:t>
-      </w:r>
-      <w:r>
-        <w:rPr>
-          <w:b/>
-          <w:bCs/>
-        </w:rPr>
-        <w:t xml:space="preserve"> : i = </w:t>
-      </w:r>
-      <w:r>
-        <w:rPr>
-          <w:b/>
-          <w:bCs/>
-        </w:rPr>
+        <w:t>PASSAGE 3 : i = 2</w:t>
+      </w:r>
+    </w:p>
+    <w:p>
+      <w:pPr>
+        <w:jc w:val="both"/>
+        <w:rPr>
+          <w:b/>
+          <w:bCs/>
+        </w:rPr>
+      </w:pPr>
+      <w:proofErr w:type="spellStart"/>
+      <w:r>
+        <w:rPr>
+          <w:b/>
+          <w:bCs/>
+        </w:rPr>
+        <w:t>indexMin</w:t>
+      </w:r>
+      <w:proofErr w:type="spellEnd"/>
+      <w:r>
+        <w:rPr>
+          <w:b/>
+          <w:bCs/>
+        </w:rPr>
+        <w:t xml:space="preserve"> = 2</w:t>
+      </w:r>
+    </w:p>
+    <w:p>
+      <w:pPr>
+        <w:jc w:val="both"/>
+      </w:pPr>
+      <w:r>
+        <w:rPr>
+          <w:b/>
+          <w:bCs/>
+        </w:rPr>
+        <w:t xml:space="preserve">Tour 1 : j = 3 </w:t>
+      </w:r>
+      <w:r>
+        <w:t xml:space="preserve">-&gt; comparer </w:t>
+      </w:r>
+      <w:proofErr w:type="spellStart"/>
+      <w:r>
+        <w:t>indexMin</w:t>
+      </w:r>
+      <w:proofErr w:type="spellEnd"/>
+      <w:r>
+        <w:t xml:space="preserve"> 2 à index j 3 (valeur 14 et 37) -&gt; </w:t>
+      </w:r>
+      <w:proofErr w:type="spellStart"/>
+      <w:r>
+        <w:t>indexMin</w:t>
+      </w:r>
+      <w:proofErr w:type="spellEnd"/>
+      <w:r>
+        <w:t xml:space="preserve"> = 2</w:t>
+      </w:r>
+    </w:p>
+    <w:p>
+      <w:pPr>
+        <w:jc w:val="both"/>
+      </w:pPr>
+      <w:r>
+        <w:rPr>
+          <w:b/>
+          <w:bCs/>
+        </w:rPr>
+        <w:t>Tour 2 : j = 4</w:t>
+      </w:r>
+      <w:r>
+        <w:t xml:space="preserve"> -&gt; comparer </w:t>
+      </w:r>
+      <w:proofErr w:type="spellStart"/>
+      <w:r>
+        <w:t>indexMin</w:t>
+      </w:r>
+      <w:proofErr w:type="spellEnd"/>
+      <w:r>
+        <w:t xml:space="preserve"> 2 à index j 4 (valeur 14 et 29) -&gt; </w:t>
+      </w:r>
+      <w:proofErr w:type="spellStart"/>
+      <w:r>
+        <w:t>indexMin</w:t>
+      </w:r>
+      <w:proofErr w:type="spellEnd"/>
+      <w:r>
+        <w:t xml:space="preserve"> = 2</w:t>
+      </w:r>
+    </w:p>
+    <w:p>
+      <w:pPr>
+        <w:jc w:val="both"/>
+        <w:rPr>
+          <w:b/>
+          <w:bCs/>
+        </w:rPr>
+      </w:pPr>
+      <w:r>
+        <w:rPr>
+          <w:b/>
+          <w:bCs/>
+        </w:rPr>
+        <w:t>Tour 3 : j = 5</w:t>
+      </w:r>
+      <w:r>
+        <w:t xml:space="preserve"> -&gt; comparer </w:t>
+      </w:r>
+      <w:proofErr w:type="spellStart"/>
+      <w:r>
+        <w:t>indexMin</w:t>
+      </w:r>
+      <w:proofErr w:type="spellEnd"/>
+      <w:r>
+        <w:t xml:space="preserve"> 2 à index j 5 (valeur 14 et 25) -&gt; </w:t>
+      </w:r>
+      <w:proofErr w:type="spellStart"/>
+      <w:r>
+        <w:t>indexMin</w:t>
+      </w:r>
+      <w:proofErr w:type="spellEnd"/>
+      <w:r>
+        <w:t xml:space="preserve"> = 2 </w:t>
+      </w:r>
+      <w:r>
+        <w:rPr>
+          <w:b/>
+          <w:bCs/>
+        </w:rPr>
+        <w:t>-&gt; fin boucle j</w:t>
+      </w:r>
+    </w:p>
+    <w:p>
+      <w:pPr>
+        <w:jc w:val="both"/>
+      </w:pPr>
+      <w:proofErr w:type="spellStart"/>
+      <w:r>
+        <w:t>indexMin</w:t>
+      </w:r>
+      <w:proofErr w:type="spellEnd"/>
+      <w:r>
+        <w:t xml:space="preserve"> est égal à i (</w:t>
+      </w:r>
+      <w:r>
         <w:t>2</w:t>
       </w:r>
-    </w:p>
-    <w:p>
-      <w:pPr>
-        <w:jc w:val="both"/>
-        <w:rPr>
-          <w:b/>
-          <w:bCs/>
-        </w:rPr>
-      </w:pPr>
-      <w:proofErr w:type="spellStart"/>
-      <w:proofErr w:type="gramStart"/>
-      <w:r>
-        <w:rPr>
-          <w:b/>
-          <w:bCs/>
-        </w:rPr>
-        <w:t>indexMin</w:t>
-      </w:r>
-      <w:proofErr w:type="spellEnd"/>
-      <w:proofErr w:type="gramEnd"/>
-      <w:r>
-        <w:rPr>
-          <w:b/>
-          <w:bCs/>
-        </w:rPr>
-        <w:t xml:space="preserve"> = </w:t>
-      </w:r>
-      <w:r>
-        <w:rPr>
-          <w:b/>
-          <w:bCs/>
-        </w:rPr>
+      <w:r>
+        <w:t xml:space="preserve"> == </w:t>
+      </w:r>
+      <w:r>
         <w:t>2</w:t>
       </w:r>
-    </w:p>
-    <w:p>
-      <w:pPr>
-        <w:jc w:val="both"/>
-      </w:pPr>
-      <w:r>
-        <w:rPr>
-          <w:b/>
-          <w:bCs/>
-        </w:rPr>
-        <w:t xml:space="preserve">Tour 1 : j = </w:t>
-      </w:r>
-      <w:r>
-        <w:rPr>
-          <w:b/>
-          <w:bCs/>
-        </w:rPr>
-        <w:t>3</w:t>
-      </w:r>
-      <w:r>
-        <w:rPr>
-          <w:b/>
-          <w:bCs/>
-        </w:rPr>
-        <w:t xml:space="preserve"> </w:t>
-      </w:r>
-      <w:r>
-        <w:t xml:space="preserve">-&gt; comparer </w:t>
-      </w:r>
-      <w:proofErr w:type="spellStart"/>
-      <w:r>
-        <w:t>indexMin</w:t>
-      </w:r>
-      <w:proofErr w:type="spellEnd"/>
-      <w:r>
-        <w:t xml:space="preserve"> </w:t>
-      </w:r>
-      <w:r>
-        <w:t>2</w:t>
-      </w:r>
-      <w:r>
-        <w:t xml:space="preserve"> à index j </w:t>
-      </w:r>
-      <w:r>
-        <w:t>3</w:t>
-      </w:r>
-      <w:r>
-        <w:t xml:space="preserve"> (valeur </w:t>
-      </w:r>
-      <w:r>
-        <w:t>14</w:t>
-      </w:r>
-      <w:r>
-        <w:t xml:space="preserve"> et </w:t>
-      </w:r>
-      <w:r>
-        <w:t>37</w:t>
-      </w:r>
-      <w:r>
-        <w:t xml:space="preserve">) -&gt; </w:t>
-      </w:r>
-      <w:proofErr w:type="spellStart"/>
-      <w:r>
-        <w:t>indexMin</w:t>
-      </w:r>
-      <w:proofErr w:type="spellEnd"/>
-      <w:r>
-        <w:t xml:space="preserve"> = 2</w:t>
-      </w:r>
-    </w:p>
-    <w:p>
-      <w:pPr>
-        <w:jc w:val="both"/>
-      </w:pPr>
-      <w:r>
-        <w:rPr>
-          <w:b/>
-          <w:bCs/>
-        </w:rPr>
-        <w:t xml:space="preserve">Tour </w:t>
-      </w:r>
-      <w:r>
-        <w:rPr>
-          <w:b/>
-          <w:bCs/>
-        </w:rPr>
-        <w:t>2</w:t>
-      </w:r>
-      <w:r>
-        <w:rPr>
-          <w:b/>
-          <w:bCs/>
-        </w:rPr>
-        <w:t xml:space="preserve"> : j = </w:t>
-      </w:r>
-      <w:r>
-        <w:rPr>
-          <w:b/>
-          <w:bCs/>
-        </w:rPr>
-        <w:t>4</w:t>
-      </w:r>
-      <w:r>
-        <w:t xml:space="preserve"> -&gt; comparer </w:t>
-      </w:r>
-      <w:proofErr w:type="spellStart"/>
-      <w:r>
-        <w:t>indexMin</w:t>
-      </w:r>
-      <w:proofErr w:type="spellEnd"/>
-      <w:r>
-        <w:t xml:space="preserve"> 2 à index j </w:t>
-      </w:r>
-      <w:r>
-        <w:t>4</w:t>
-      </w:r>
-      <w:r>
-        <w:t xml:space="preserve"> (valeur 14 et </w:t>
-      </w:r>
-      <w:r>
-        <w:t>29</w:t>
-      </w:r>
-      <w:r>
-        <w:t xml:space="preserve">) -&gt; </w:t>
-      </w:r>
-      <w:proofErr w:type="spellStart"/>
-      <w:r>
-        <w:t>indexMin</w:t>
-      </w:r>
-      <w:proofErr w:type="spellEnd"/>
-      <w:r>
-        <w:t xml:space="preserve"> = 2</w:t>
-      </w:r>
-    </w:p>
-    <w:p>
-      <w:pPr>
-        <w:jc w:val="both"/>
-        <w:rPr>
-          <w:b/>
-          <w:bCs/>
-        </w:rPr>
-      </w:pPr>
-      <w:r>
-        <w:rPr>
-          <w:b/>
-          <w:bCs/>
-        </w:rPr>
-        <w:t xml:space="preserve">Tour 3 : j = </w:t>
-      </w:r>
-      <w:r>
-        <w:rPr>
-          <w:b/>
-          <w:bCs/>
-        </w:rPr>
-        <w:t>5</w:t>
-      </w:r>
-      <w:r>
-        <w:t xml:space="preserve"> -&gt; comparer </w:t>
-      </w:r>
-      <w:proofErr w:type="spellStart"/>
-      <w:r>
-        <w:t>indexMin</w:t>
-      </w:r>
-      <w:proofErr w:type="spellEnd"/>
-      <w:r>
-        <w:t xml:space="preserve"> 2 à index j </w:t>
-      </w:r>
-      <w:r>
-        <w:t>5</w:t>
-      </w:r>
-      <w:r>
-        <w:t xml:space="preserve"> (valeur 14 et </w:t>
-      </w:r>
-      <w:r>
-        <w:t>25</w:t>
-      </w:r>
-      <w:r>
-        <w:t xml:space="preserve">) -&gt; </w:t>
-      </w:r>
-      <w:proofErr w:type="spellStart"/>
-      <w:r>
-        <w:t>indexMin</w:t>
-      </w:r>
-      <w:proofErr w:type="spellEnd"/>
-      <w:r>
-        <w:t xml:space="preserve"> = </w:t>
-      </w:r>
-      <w:r>
-        <w:t xml:space="preserve">2 </w:t>
-      </w:r>
-      <w:r>
-        <w:rPr>
-          <w:b/>
-          <w:bCs/>
-        </w:rPr>
-        <w:t>-&gt; fin boucle j</w:t>
-      </w:r>
-    </w:p>
-    <w:p>
-      <w:pPr>
-        <w:jc w:val="both"/>
-      </w:pPr>
-      <w:proofErr w:type="spellStart"/>
-      <w:proofErr w:type="gramStart"/>
-      <w:r>
-        <w:t>indexMin</w:t>
-      </w:r>
-      <w:proofErr w:type="spellEnd"/>
-      <w:proofErr w:type="gramEnd"/>
-      <w:r>
-        <w:t xml:space="preserve"> est </w:t>
-      </w:r>
-      <w:r>
-        <w:t>égal à</w:t>
-      </w:r>
-      <w:r>
-        <w:t xml:space="preserve"> i (</w:t>
-      </w:r>
-      <w:r>
-        <w:t>2</w:t>
-      </w:r>
-      <w:r>
-        <w:t> =</w:t>
-      </w:r>
-      <w:r>
-        <w:t>=</w:t>
-      </w:r>
-      <w:r>
-        <w:t xml:space="preserve"> </w:t>
-      </w:r>
-      <w:r>
-        <w:t>2</w:t>
-      </w:r>
-      <w:r>
-        <w:t xml:space="preserve">) =&gt; </w:t>
-      </w:r>
-      <w:r>
-        <w:t>Pas d’</w:t>
-      </w:r>
-      <w:r>
-        <w:t>Echange</w:t>
+      <w:r>
+        <w:t>) =&gt; Pas d’Echange</w:t>
       </w:r>
     </w:p>
     <w:p>
@@ -2527,28 +2178,7 @@
           <w:b/>
           <w:bCs/>
         </w:rPr>
-        <w:t xml:space="preserve">PASSAGE </w:t>
-      </w:r>
-      <w:r>
-        <w:rPr>
-          <w:b/>
-          <w:bCs/>
-        </w:rPr>
-        <w:t>4</w:t>
-      </w:r>
-      <w:r>
-        <w:rPr>
-          <w:b/>
-          <w:bCs/>
-        </w:rPr>
-        <w:t xml:space="preserve"> : i = </w:t>
-      </w:r>
-      <w:r>
-        <w:rPr>
-          <w:b/>
-          <w:bCs/>
-        </w:rPr>
-        <w:t>3</w:t>
+        <w:t>PASSAGE 4 : i = 3</w:t>
       </w:r>
     </w:p>
     <w:p>
@@ -2560,7 +2190,6 @@
         </w:rPr>
       </w:pPr>
       <w:proofErr w:type="spellStart"/>
-      <w:proofErr w:type="gramStart"/>
       <w:r>
         <w:rPr>
           <w:b/>
@@ -2569,20 +2198,12 @@
         <w:t>indexMin</w:t>
       </w:r>
       <w:proofErr w:type="spellEnd"/>
-      <w:proofErr w:type="gramEnd"/>
-      <w:r>
-        <w:rPr>
-          <w:b/>
-          <w:bCs/>
-        </w:rPr>
-        <w:t xml:space="preserve"> = </w:t>
-      </w:r>
-      <w:r>
-        <w:rPr>
-          <w:b/>
-          <w:bCs/>
-        </w:rPr>
-        <w:t>3</w:t>
+      <w:r>
+        <w:rPr>
+          <w:b/>
+          <w:bCs/>
+        </w:rPr>
+        <w:t xml:space="preserve"> = 3</w:t>
       </w:r>
     </w:p>
     <w:p>
@@ -2594,21 +2215,7 @@
           <w:b/>
           <w:bCs/>
         </w:rPr>
-        <w:t xml:space="preserve">Tour 1 : j = </w:t>
-      </w:r>
-      <w:r>
-        <w:rPr>
-          <w:b/>
-          <w:bCs/>
-        </w:rPr>
-        <w:t>4</w:t>
-      </w:r>
-      <w:r>
-        <w:rPr>
-          <w:b/>
-          <w:bCs/>
-        </w:rPr>
-        <w:t xml:space="preserve"> </w:t>
+        <w:t xml:space="preserve">Tour 1 : j = 4 </w:t>
       </w:r>
       <w:r>
         <w:t xml:space="preserve">-&gt; comparer </w:t>
@@ -2619,31 +2226,7 @@
       </w:r>
       <w:proofErr w:type="spellEnd"/>
       <w:r>
-        <w:t xml:space="preserve"> </w:t>
-      </w:r>
-      <w:r>
-        <w:t>3</w:t>
-      </w:r>
-      <w:r>
-        <w:t xml:space="preserve"> à index j </w:t>
-      </w:r>
-      <w:r>
-        <w:t>4</w:t>
-      </w:r>
-      <w:r>
-        <w:t xml:space="preserve"> (valeur </w:t>
-      </w:r>
-      <w:r>
-        <w:t>37</w:t>
-      </w:r>
-      <w:r>
-        <w:t xml:space="preserve"> et </w:t>
-      </w:r>
-      <w:r>
-        <w:t>29</w:t>
-      </w:r>
-      <w:r>
-        <w:t xml:space="preserve">) -&gt; </w:t>
+        <w:t xml:space="preserve"> 3 à index j 4 (valeur 37 et 29) -&gt; </w:t>
       </w:r>
       <w:proofErr w:type="spellStart"/>
       <w:r>
@@ -2651,10 +2234,7 @@
       </w:r>
       <w:proofErr w:type="spellEnd"/>
       <w:r>
-        <w:t xml:space="preserve"> = </w:t>
-      </w:r>
-      <w:r>
-        <w:t>4</w:t>
+        <w:t xml:space="preserve"> = 4</w:t>
       </w:r>
     </w:p>
     <w:p>
@@ -2670,14 +2250,7 @@
           <w:b/>
           <w:bCs/>
         </w:rPr>
-        <w:t xml:space="preserve">Tour 2 : j = </w:t>
-      </w:r>
-      <w:r>
-        <w:rPr>
-          <w:b/>
-          <w:bCs/>
-        </w:rPr>
-        <w:t>5</w:t>
+        <w:t>Tour 2 : j = 5</w:t>
       </w:r>
       <w:r>
         <w:t xml:space="preserve"> -&gt; comparer </w:t>
@@ -2688,31 +2261,7 @@
       </w:r>
       <w:proofErr w:type="spellEnd"/>
       <w:r>
-        <w:t xml:space="preserve"> </w:t>
-      </w:r>
-      <w:r>
-        <w:t>4</w:t>
-      </w:r>
-      <w:r>
-        <w:t xml:space="preserve"> à index j </w:t>
-      </w:r>
-      <w:r>
-        <w:t>5</w:t>
-      </w:r>
-      <w:r>
-        <w:t xml:space="preserve"> (valeur </w:t>
-      </w:r>
-      <w:r>
-        <w:t>29</w:t>
-      </w:r>
-      <w:r>
-        <w:t xml:space="preserve"> et 2</w:t>
-      </w:r>
-      <w:r>
-        <w:t>5</w:t>
-      </w:r>
-      <w:r>
-        <w:t xml:space="preserve">) -&gt; </w:t>
+        <w:t xml:space="preserve"> 4 à index j 5 (valeur 29 et 25) -&gt; </w:t>
       </w:r>
       <w:proofErr w:type="spellStart"/>
       <w:r>
@@ -2720,10 +2269,7 @@
       </w:r>
       <w:proofErr w:type="spellEnd"/>
       <w:r>
-        <w:t xml:space="preserve"> = </w:t>
-      </w:r>
-      <w:r>
-        <w:t xml:space="preserve">5 </w:t>
+        <w:t xml:space="preserve"> = 5 </w:t>
       </w:r>
       <w:r>
         <w:rPr>
@@ -2738,43 +2284,12 @@
         <w:jc w:val="both"/>
       </w:pPr>
       <w:proofErr w:type="spellStart"/>
-      <w:proofErr w:type="gramStart"/>
       <w:r>
         <w:t>indexMin</w:t>
       </w:r>
       <w:proofErr w:type="spellEnd"/>
-      <w:proofErr w:type="gramEnd"/>
-      <w:r>
-        <w:t xml:space="preserve"> est </w:t>
-      </w:r>
-      <w:r>
-        <w:t>différent de</w:t>
-      </w:r>
-      <w:r>
-        <w:t xml:space="preserve"> i (</w:t>
-      </w:r>
-      <w:r>
-        <w:t>5</w:t>
-      </w:r>
-      <w:proofErr w:type="gramStart"/>
-      <w:r>
-        <w:t> !</w:t>
-      </w:r>
-      <w:r>
-        <w:t>=</w:t>
-      </w:r>
-      <w:proofErr w:type="gramEnd"/>
-      <w:r>
-        <w:t xml:space="preserve"> </w:t>
-      </w:r>
-      <w:r>
-        <w:t>3</w:t>
-      </w:r>
-      <w:r>
-        <w:t>) =&gt; Echange</w:t>
-      </w:r>
-      <w:r>
-        <w:t xml:space="preserve"> entre les valeurs des cases</w:t>
+      <w:r>
+        <w:t xml:space="preserve"> est différent de i (5 != 3) =&gt; Echange entre les valeurs des cases</w:t>
       </w:r>
     </w:p>
     <w:p>
@@ -2895,28 +2410,7 @@
           <w:b/>
           <w:bCs/>
         </w:rPr>
-        <w:t xml:space="preserve">PASSAGE </w:t>
-      </w:r>
-      <w:r>
-        <w:rPr>
-          <w:b/>
-          <w:bCs/>
-        </w:rPr>
-        <w:t>5</w:t>
-      </w:r>
-      <w:r>
-        <w:rPr>
-          <w:b/>
-          <w:bCs/>
-        </w:rPr>
-        <w:t xml:space="preserve"> : i = </w:t>
-      </w:r>
-      <w:r>
-        <w:rPr>
-          <w:b/>
-          <w:bCs/>
-        </w:rPr>
-        <w:t>4</w:t>
+        <w:t>PASSAGE 5 : i = 4</w:t>
       </w:r>
     </w:p>
     <w:p>
@@ -2928,7 +2422,6 @@
         </w:rPr>
       </w:pPr>
       <w:proofErr w:type="spellStart"/>
-      <w:proofErr w:type="gramStart"/>
       <w:r>
         <w:rPr>
           <w:b/>
@@ -2937,20 +2430,12 @@
         <w:t>indexMin</w:t>
       </w:r>
       <w:proofErr w:type="spellEnd"/>
-      <w:proofErr w:type="gramEnd"/>
-      <w:r>
-        <w:rPr>
-          <w:b/>
-          <w:bCs/>
-        </w:rPr>
-        <w:t xml:space="preserve"> = </w:t>
-      </w:r>
-      <w:r>
-        <w:rPr>
-          <w:b/>
-          <w:bCs/>
-        </w:rPr>
-        <w:t>4</w:t>
+      <w:r>
+        <w:rPr>
+          <w:b/>
+          <w:bCs/>
+        </w:rPr>
+        <w:t xml:space="preserve"> = 4</w:t>
       </w:r>
     </w:p>
     <w:p>
@@ -2966,21 +2451,7 @@
           <w:b/>
           <w:bCs/>
         </w:rPr>
-        <w:t xml:space="preserve">Tour 1 : j = </w:t>
-      </w:r>
-      <w:r>
-        <w:rPr>
-          <w:b/>
-          <w:bCs/>
-        </w:rPr>
-        <w:t>5</w:t>
-      </w:r>
-      <w:r>
-        <w:rPr>
-          <w:b/>
-          <w:bCs/>
-        </w:rPr>
-        <w:t xml:space="preserve"> </w:t>
+        <w:t xml:space="preserve">Tour 1 : j = 5 </w:t>
       </w:r>
       <w:r>
         <w:t xml:space="preserve">-&gt; comparer </w:t>
@@ -2991,31 +2462,7 @@
       </w:r>
       <w:proofErr w:type="spellEnd"/>
       <w:r>
-        <w:t xml:space="preserve"> </w:t>
-      </w:r>
-      <w:r>
-        <w:t>4</w:t>
-      </w:r>
-      <w:r>
-        <w:t xml:space="preserve"> à index j </w:t>
-      </w:r>
-      <w:r>
-        <w:t>5</w:t>
-      </w:r>
-      <w:r>
-        <w:t xml:space="preserve"> (valeur </w:t>
-      </w:r>
-      <w:r>
-        <w:t>29</w:t>
-      </w:r>
-      <w:r>
-        <w:t xml:space="preserve"> et </w:t>
-      </w:r>
-      <w:r>
-        <w:t>37</w:t>
-      </w:r>
-      <w:r>
-        <w:t xml:space="preserve">) -&gt; </w:t>
+        <w:t xml:space="preserve"> 4 à index j 5 (valeur 29 et 37) -&gt; </w:t>
       </w:r>
       <w:proofErr w:type="spellStart"/>
       <w:r>
@@ -3023,13 +2470,7 @@
       </w:r>
       <w:proofErr w:type="spellEnd"/>
       <w:r>
-        <w:t xml:space="preserve"> = </w:t>
-      </w:r>
-      <w:r>
-        <w:t>4</w:t>
-      </w:r>
-      <w:r>
-        <w:t xml:space="preserve"> </w:t>
+        <w:t xml:space="preserve"> = 4 </w:t>
       </w:r>
       <w:r>
         <w:rPr>
@@ -3044,38 +2485,12 @@
         <w:jc w:val="both"/>
       </w:pPr>
       <w:proofErr w:type="spellStart"/>
-      <w:proofErr w:type="gramStart"/>
       <w:r>
         <w:t>indexMin</w:t>
       </w:r>
       <w:proofErr w:type="spellEnd"/>
-      <w:proofErr w:type="gramEnd"/>
-      <w:r>
-        <w:t xml:space="preserve"> est </w:t>
-      </w:r>
-      <w:r>
-        <w:t>égal à</w:t>
-      </w:r>
-      <w:r>
-        <w:t xml:space="preserve"> i (</w:t>
-      </w:r>
-      <w:r>
-        <w:t>4 =</w:t>
-      </w:r>
-      <w:r>
-        <w:t xml:space="preserve">= </w:t>
-      </w:r>
-      <w:r>
-        <w:t>4</w:t>
-      </w:r>
-      <w:r>
-        <w:t xml:space="preserve">) =&gt; </w:t>
-      </w:r>
-      <w:r>
-        <w:t>Pas d’</w:t>
-      </w:r>
-      <w:r>
-        <w:t>Echange entre les valeurs des cases</w:t>
+      <w:r>
+        <w:t xml:space="preserve"> est égal à i (4 == 4) =&gt; Pas d’Echange entre les valeurs des cases</w:t>
       </w:r>
     </w:p>
     <w:p>
@@ -3164,7 +2579,716 @@
     <w:p>
       <w:pPr>
         <w:jc w:val="both"/>
-      </w:pPr>
+        <w:rPr>
+          <w:b/>
+          <w:bCs/>
+        </w:rPr>
+      </w:pPr>
+    </w:p>
+    <w:p>
+      <w:pPr>
+        <w:pStyle w:val="Titre1"/>
+      </w:pPr>
+      <w:r>
+        <w:lastRenderedPageBreak/>
+        <w:t>Exercice 3 : Trier puis chercher</w:t>
+      </w:r>
+    </w:p>
+    <w:p>
+      <w:pPr>
+        <w:jc w:val="both"/>
+      </w:pPr>
+      <w:r>
+        <w:t xml:space="preserve">Soit le tableau : [45, 12, 89, 23, 67, 34, 5, 78] </w:t>
+      </w:r>
+    </w:p>
+    <w:p>
+      <w:pPr>
+        <w:numPr>
+          <w:ilvl w:val="0"/>
+          <w:numId w:val="55"/>
+        </w:numPr>
+        <w:jc w:val="both"/>
+      </w:pPr>
+      <w:r>
+        <w:t>Trier ce tableau en utilisant le tri à bulles OU le tri par sélection (au choix)</w:t>
+      </w:r>
+    </w:p>
+    <w:p>
+      <w:pPr>
+        <w:numPr>
+          <w:ilvl w:val="0"/>
+          <w:numId w:val="55"/>
+        </w:numPr>
+        <w:jc w:val="both"/>
+      </w:pPr>
+      <w:r>
+        <w:t>Une fois trié, utiliser la recherche dichotomique pour trouver le nombre 67</w:t>
+      </w:r>
+    </w:p>
+    <w:p>
+      <w:pPr>
+        <w:numPr>
+          <w:ilvl w:val="0"/>
+          <w:numId w:val="55"/>
+        </w:numPr>
+        <w:jc w:val="both"/>
+      </w:pPr>
+      <w:r>
+        <w:t>Tracer l'exécution de la recherche dichotomique</w:t>
+      </w:r>
+    </w:p>
+    <w:p>
+      <w:pPr>
+        <w:pStyle w:val="Code"/>
+      </w:pPr>
+      <w:r>
+        <w:t xml:space="preserve">     tab &lt;- </w:t>
+      </w:r>
+      <w:r>
+        <w:t>[45, 12, 89, 23, 67, 34, 5, 78]</w:t>
+      </w:r>
+      <w:r>
+        <w:br/>
+      </w:r>
+    </w:p>
+    <w:p>
+      <w:pPr>
+        <w:pStyle w:val="Code"/>
+      </w:pPr>
+      <w:r>
+        <w:t xml:space="preserve">     </w:t>
+      </w:r>
+      <w:r>
+        <w:rPr>
+          <w:color w:val="EE0000"/>
+        </w:rPr>
+        <w:t>//ALGO DU TRIE PAR SELECTION</w:t>
+      </w:r>
+    </w:p>
+    <w:p>
+      <w:pPr>
+        <w:pStyle w:val="Code"/>
+      </w:pPr>
+      <w:r>
+        <w:t xml:space="preserve">     POUR i de 0 à taille de tab - 2</w:t>
+      </w:r>
+    </w:p>
+    <w:p>
+      <w:pPr>
+        <w:pStyle w:val="Code"/>
+      </w:pPr>
+      <w:r>
+        <w:t xml:space="preserve">        </w:t>
+      </w:r>
+      <w:proofErr w:type="spellStart"/>
+      <w:r>
+        <w:t>indexMin</w:t>
+      </w:r>
+      <w:proofErr w:type="spellEnd"/>
+      <w:r>
+        <w:t xml:space="preserve"> &lt;- i</w:t>
+      </w:r>
+    </w:p>
+    <w:p>
+      <w:pPr>
+        <w:pStyle w:val="Code"/>
+      </w:pPr>
+      <w:r>
+        <w:t xml:space="preserve">        POUR j de i + 1 à taille de tab – 1</w:t>
+      </w:r>
+    </w:p>
+    <w:p>
+      <w:pPr>
+        <w:pStyle w:val="Code"/>
+      </w:pPr>
+      <w:r>
+        <w:t xml:space="preserve">           SI tab[</w:t>
+      </w:r>
+      <w:proofErr w:type="spellStart"/>
+      <w:r>
+        <w:t>indexMin</w:t>
+      </w:r>
+      <w:proofErr w:type="spellEnd"/>
+      <w:r>
+        <w:t>] &gt; tab[j]</w:t>
+      </w:r>
+    </w:p>
+    <w:p>
+      <w:pPr>
+        <w:pStyle w:val="Code"/>
+      </w:pPr>
+      <w:r>
+        <w:t xml:space="preserve">             </w:t>
+      </w:r>
+      <w:proofErr w:type="spellStart"/>
+      <w:r>
+        <w:t>indexMin</w:t>
+      </w:r>
+      <w:proofErr w:type="spellEnd"/>
+      <w:r>
+        <w:t xml:space="preserve"> &lt;- j</w:t>
+      </w:r>
+    </w:p>
+    <w:p>
+      <w:pPr>
+        <w:pStyle w:val="Code"/>
+      </w:pPr>
+      <w:r>
+        <w:t xml:space="preserve">           FIN SI</w:t>
+      </w:r>
+    </w:p>
+    <w:p>
+      <w:pPr>
+        <w:pStyle w:val="Code"/>
+      </w:pPr>
+      <w:r>
+        <w:t xml:space="preserve">        FIN POUR</w:t>
+      </w:r>
+      <w:r>
+        <w:br/>
+      </w:r>
+    </w:p>
+    <w:p>
+      <w:pPr>
+        <w:pStyle w:val="Code"/>
+      </w:pPr>
+      <w:r>
+        <w:t xml:space="preserve">        SI </w:t>
+      </w:r>
+      <w:proofErr w:type="spellStart"/>
+      <w:r>
+        <w:t>indexMin</w:t>
+      </w:r>
+      <w:proofErr w:type="spellEnd"/>
+      <w:r>
+        <w:t xml:space="preserve"> est différent de i</w:t>
+      </w:r>
+    </w:p>
+    <w:p>
+      <w:pPr>
+        <w:pStyle w:val="Code"/>
+      </w:pPr>
+      <w:r>
+        <w:t xml:space="preserve">      temp &lt;- tab[</w:t>
+      </w:r>
+      <w:proofErr w:type="spellStart"/>
+      <w:r>
+        <w:t>indexMin</w:t>
+      </w:r>
+      <w:proofErr w:type="spellEnd"/>
+      <w:r>
+        <w:t>]</w:t>
+      </w:r>
+    </w:p>
+    <w:p>
+      <w:pPr>
+        <w:pStyle w:val="Code"/>
+      </w:pPr>
+      <w:r>
+        <w:t xml:space="preserve">      tab[</w:t>
+      </w:r>
+      <w:proofErr w:type="spellStart"/>
+      <w:r>
+        <w:t>indexMin</w:t>
+      </w:r>
+      <w:proofErr w:type="spellEnd"/>
+      <w:r>
+        <w:t>] &lt;- tab[i]</w:t>
+      </w:r>
+    </w:p>
+    <w:p>
+      <w:pPr>
+        <w:pStyle w:val="Code"/>
+      </w:pPr>
+      <w:r>
+        <w:t xml:space="preserve">      tab[i] &lt;- temp</w:t>
+      </w:r>
+    </w:p>
+    <w:p>
+      <w:pPr>
+        <w:pStyle w:val="Code"/>
+      </w:pPr>
+      <w:r>
+        <w:t xml:space="preserve">   FIN SI</w:t>
+      </w:r>
+    </w:p>
+    <w:p>
+      <w:pPr>
+        <w:pStyle w:val="Code"/>
+      </w:pPr>
+      <w:r>
+        <w:t>FIN POUR</w:t>
+      </w:r>
+      <w:r>
+        <w:br/>
+      </w:r>
+      <w:r>
+        <w:br/>
+      </w:r>
+    </w:p>
+    <w:p>
+      <w:pPr>
+        <w:pStyle w:val="Code"/>
+        <w:rPr>
+          <w:color w:val="EE0000"/>
+        </w:rPr>
+      </w:pPr>
+      <w:r>
+        <w:rPr>
+          <w:color w:val="EE0000"/>
+        </w:rPr>
+        <w:t>//ALGO DU TRIE A BULLE</w:t>
+      </w:r>
+    </w:p>
+    <w:p>
+      <w:pPr>
+        <w:pStyle w:val="Code"/>
+      </w:pPr>
+      <w:r>
+        <w:t>POUR i de 0 à taille de tab - 2</w:t>
+      </w:r>
+    </w:p>
+    <w:p>
+      <w:pPr>
+        <w:pStyle w:val="Code"/>
+      </w:pPr>
+      <w:r>
+        <w:t xml:space="preserve">  POUR j de </w:t>
+      </w:r>
+      <w:r>
+        <w:t>0</w:t>
+      </w:r>
+      <w:r>
+        <w:t xml:space="preserve"> à taille de tab – </w:t>
+      </w:r>
+      <w:r>
+        <w:t>2 - i</w:t>
+      </w:r>
+    </w:p>
+    <w:p>
+      <w:pPr>
+        <w:pStyle w:val="Code"/>
+      </w:pPr>
+      <w:r>
+        <w:t xml:space="preserve">     SI tab[</w:t>
+      </w:r>
+      <w:r>
+        <w:t>j</w:t>
+      </w:r>
+      <w:r>
+        <w:t>] &gt; tab[j</w:t>
+      </w:r>
+      <w:r>
+        <w:t>+1</w:t>
+      </w:r>
+      <w:r>
+        <w:t>]</w:t>
+      </w:r>
+    </w:p>
+    <w:p>
+      <w:pPr>
+        <w:pStyle w:val="Code"/>
+      </w:pPr>
+      <w:r>
+        <w:t xml:space="preserve">       temp &lt;- tab[</w:t>
+      </w:r>
+      <w:r>
+        <w:t>j</w:t>
+      </w:r>
+      <w:r>
+        <w:t>]</w:t>
+      </w:r>
+    </w:p>
+    <w:p>
+      <w:pPr>
+        <w:pStyle w:val="Code"/>
+      </w:pPr>
+      <w:r>
+        <w:t xml:space="preserve">   </w:t>
+      </w:r>
+      <w:r>
+        <w:t xml:space="preserve">    </w:t>
+      </w:r>
+      <w:r>
+        <w:t>tab[</w:t>
+      </w:r>
+      <w:r>
+        <w:t>j</w:t>
+      </w:r>
+      <w:r>
+        <w:t>] &lt;- tab[</w:t>
+      </w:r>
+      <w:r>
+        <w:t>j+1</w:t>
+      </w:r>
+      <w:r>
+        <w:t>]</w:t>
+      </w:r>
+    </w:p>
+    <w:p>
+      <w:pPr>
+        <w:pStyle w:val="Code"/>
+      </w:pPr>
+      <w:r>
+        <w:t xml:space="preserve">      </w:t>
+      </w:r>
+      <w:r>
+        <w:t xml:space="preserve"> </w:t>
+      </w:r>
+      <w:r>
+        <w:t>tab[</w:t>
+      </w:r>
+      <w:r>
+        <w:t>j+1</w:t>
+      </w:r>
+      <w:r>
+        <w:t>] &lt;- temp</w:t>
+      </w:r>
+    </w:p>
+    <w:p>
+      <w:pPr>
+        <w:pStyle w:val="Code"/>
+      </w:pPr>
+      <w:r>
+        <w:t xml:space="preserve">     FIN SI</w:t>
+      </w:r>
+    </w:p>
+    <w:p>
+      <w:pPr>
+        <w:pStyle w:val="Code"/>
+      </w:pPr>
+      <w:r>
+        <w:t xml:space="preserve">  FIN POUR</w:t>
+      </w:r>
+    </w:p>
+    <w:p>
+      <w:pPr>
+        <w:pStyle w:val="Code"/>
+      </w:pPr>
+      <w:r>
+        <w:t>FIN POUR</w:t>
+      </w:r>
+      <w:r>
+        <w:br/>
+      </w:r>
+      <w:r>
+        <w:br/>
+      </w:r>
+    </w:p>
+    <w:p>
+      <w:pPr>
+        <w:pStyle w:val="Code"/>
+      </w:pPr>
+      <w:r>
+        <w:rPr>
+          <w:color w:val="EE0000"/>
+        </w:rPr>
+        <w:t>//TRACAGE DE LA RECHERCHE DICHOTOMIQUE</w:t>
+      </w:r>
+    </w:p>
+    <w:p>
+      <w:pPr>
+        <w:pStyle w:val="Code"/>
+        <w:rPr>
+          <w:color w:val="auto"/>
+        </w:rPr>
+      </w:pPr>
+      <w:r>
+        <w:rPr>
+          <w:b/>
+          <w:bCs/>
+          <w:color w:val="auto"/>
+        </w:rPr>
+        <w:t>Tab trié =</w:t>
+      </w:r>
+      <w:r>
+        <w:rPr>
+          <w:b/>
+          <w:bCs/>
+          <w:color w:val="auto"/>
+        </w:rPr>
+        <w:t xml:space="preserve"> </w:t>
+      </w:r>
+      <w:r>
+        <w:t>[</w:t>
+      </w:r>
+      <w:r>
+        <w:t>5,12,23,34,</w:t>
+      </w:r>
+      <w:r>
+        <w:t>45,</w:t>
+      </w:r>
+      <w:r>
+        <w:t>67,78,</w:t>
+      </w:r>
+      <w:r>
+        <w:t>89]</w:t>
+      </w:r>
+      <w:r>
+        <w:br/>
+      </w:r>
+    </w:p>
+    <w:p>
+      <w:pPr>
+        <w:pStyle w:val="Code"/>
+        <w:rPr>
+          <w:color w:val="auto"/>
+        </w:rPr>
+      </w:pPr>
+      <w:r>
+        <w:rPr>
+          <w:b/>
+          <w:bCs/>
+          <w:color w:val="auto"/>
+        </w:rPr>
+        <w:t>TOUR 1 :</w:t>
+      </w:r>
+    </w:p>
+    <w:p>
+      <w:pPr>
+        <w:pStyle w:val="Code"/>
+        <w:rPr>
+          <w:color w:val="auto"/>
+        </w:rPr>
+      </w:pPr>
+      <w:proofErr w:type="spellStart"/>
+      <w:r>
+        <w:rPr>
+          <w:b/>
+          <w:bCs/>
+          <w:color w:val="auto"/>
+        </w:rPr>
+        <w:t>indexDebut</w:t>
+      </w:r>
+      <w:proofErr w:type="spellEnd"/>
+      <w:r>
+        <w:rPr>
+          <w:b/>
+          <w:bCs/>
+          <w:color w:val="auto"/>
+        </w:rPr>
+        <w:t xml:space="preserve"> = 0</w:t>
+      </w:r>
+    </w:p>
+    <w:p>
+      <w:pPr>
+        <w:pStyle w:val="Code"/>
+        <w:rPr>
+          <w:color w:val="auto"/>
+        </w:rPr>
+      </w:pPr>
+      <w:proofErr w:type="spellStart"/>
+      <w:r>
+        <w:rPr>
+          <w:b/>
+          <w:bCs/>
+          <w:color w:val="auto"/>
+        </w:rPr>
+        <w:t>indexFin</w:t>
+      </w:r>
+      <w:proofErr w:type="spellEnd"/>
+      <w:r>
+        <w:rPr>
+          <w:b/>
+          <w:bCs/>
+          <w:color w:val="auto"/>
+        </w:rPr>
+        <w:t xml:space="preserve"> = 7</w:t>
+      </w:r>
+    </w:p>
+    <w:p>
+      <w:pPr>
+        <w:pStyle w:val="Code"/>
+        <w:rPr>
+          <w:color w:val="auto"/>
+        </w:rPr>
+      </w:pPr>
+      <w:r>
+        <w:rPr>
+          <w:b/>
+          <w:bCs/>
+          <w:color w:val="auto"/>
+        </w:rPr>
+        <w:t>milieu = 3</w:t>
+      </w:r>
+    </w:p>
+    <w:p>
+      <w:pPr>
+        <w:pStyle w:val="Code"/>
+        <w:rPr>
+          <w:color w:val="auto"/>
+        </w:rPr>
+      </w:pPr>
+      <w:r>
+        <w:rPr>
+          <w:color w:val="auto"/>
+        </w:rPr>
+        <w:t>comparer tab[3] (34) avec le nombre 67</w:t>
+      </w:r>
+    </w:p>
+    <w:p>
+      <w:pPr>
+        <w:pStyle w:val="Code"/>
+        <w:rPr>
+          <w:color w:val="auto"/>
+        </w:rPr>
+      </w:pPr>
+      <w:r>
+        <w:rPr>
+          <w:color w:val="auto"/>
+        </w:rPr>
+        <w:lastRenderedPageBreak/>
+        <w:t xml:space="preserve">=&gt; 67 &gt; 34 -&gt; relancer la recherche à droite -&gt; </w:t>
+      </w:r>
+      <w:proofErr w:type="spellStart"/>
+      <w:r>
+        <w:rPr>
+          <w:b/>
+          <w:bCs/>
+          <w:color w:val="auto"/>
+        </w:rPr>
+        <w:t>indexDebut</w:t>
+      </w:r>
+      <w:proofErr w:type="spellEnd"/>
+      <w:r>
+        <w:rPr>
+          <w:b/>
+          <w:bCs/>
+          <w:color w:val="auto"/>
+        </w:rPr>
+        <w:t xml:space="preserve"> = milieu + 1 = 4</w:t>
+      </w:r>
+      <w:r>
+        <w:rPr>
+          <w:color w:val="auto"/>
+        </w:rPr>
+        <w:br/>
+      </w:r>
+    </w:p>
+    <w:p>
+      <w:pPr>
+        <w:pStyle w:val="Code"/>
+        <w:rPr>
+          <w:color w:val="auto"/>
+        </w:rPr>
+      </w:pPr>
+      <w:r>
+        <w:rPr>
+          <w:b/>
+          <w:bCs/>
+          <w:color w:val="auto"/>
+        </w:rPr>
+        <w:t>TOUR 2 :</w:t>
+      </w:r>
+    </w:p>
+    <w:p>
+      <w:pPr>
+        <w:pStyle w:val="Code"/>
+        <w:rPr>
+          <w:color w:val="auto"/>
+        </w:rPr>
+      </w:pPr>
+      <w:proofErr w:type="spellStart"/>
+      <w:r>
+        <w:rPr>
+          <w:b/>
+          <w:bCs/>
+          <w:color w:val="auto"/>
+        </w:rPr>
+        <w:t>indexDebut</w:t>
+      </w:r>
+      <w:proofErr w:type="spellEnd"/>
+      <w:r>
+        <w:rPr>
+          <w:b/>
+          <w:bCs/>
+          <w:color w:val="auto"/>
+        </w:rPr>
+        <w:t xml:space="preserve"> = 4</w:t>
+      </w:r>
+    </w:p>
+    <w:p>
+      <w:pPr>
+        <w:pStyle w:val="Code"/>
+        <w:rPr>
+          <w:color w:val="auto"/>
+        </w:rPr>
+      </w:pPr>
+      <w:proofErr w:type="spellStart"/>
+      <w:r>
+        <w:rPr>
+          <w:b/>
+          <w:bCs/>
+          <w:color w:val="auto"/>
+        </w:rPr>
+        <w:t>indexFin</w:t>
+      </w:r>
+      <w:proofErr w:type="spellEnd"/>
+      <w:r>
+        <w:rPr>
+          <w:b/>
+          <w:bCs/>
+          <w:color w:val="auto"/>
+        </w:rPr>
+        <w:t xml:space="preserve"> = 7</w:t>
+      </w:r>
+    </w:p>
+    <w:p>
+      <w:pPr>
+        <w:pStyle w:val="Code"/>
+        <w:rPr>
+          <w:color w:val="auto"/>
+        </w:rPr>
+      </w:pPr>
+      <w:r>
+        <w:rPr>
+          <w:b/>
+          <w:bCs/>
+          <w:color w:val="auto"/>
+        </w:rPr>
+        <w:t>milieu = (4+7)/2 = 11/2 = 5</w:t>
+      </w:r>
+    </w:p>
+    <w:p>
+      <w:pPr>
+        <w:pStyle w:val="Code"/>
+        <w:rPr>
+          <w:color w:val="auto"/>
+        </w:rPr>
+      </w:pPr>
+      <w:r>
+        <w:rPr>
+          <w:color w:val="auto"/>
+        </w:rPr>
+        <w:t>comparer tab[5] (67) à 67</w:t>
+      </w:r>
+    </w:p>
+    <w:p>
+      <w:pPr>
+        <w:pStyle w:val="Code"/>
+        <w:rPr>
+          <w:color w:val="auto"/>
+        </w:rPr>
+      </w:pPr>
+      <w:r>
+        <w:rPr>
+          <w:color w:val="auto"/>
+        </w:rPr>
+        <w:t>=&gt; 67 == 67 -&gt; Nombre Trouvé </w:t>
+      </w:r>
+      <w:r>
+        <w:rPr>
+          <w:color w:val="auto"/>
+        </w:rPr>
+        <w:t xml:space="preserve">à l’indice 5 </w:t>
+      </w:r>
+      <w:r>
+        <w:rPr>
+          <w:color w:val="auto"/>
+        </w:rPr>
+        <w:t>!</w:t>
+      </w:r>
     </w:p>
     <w:sectPr>
       <w:headerReference w:type="default" r:id="rId7"/>
@@ -9500,6 +9624,119 @@
     </w:lvl>
   </w:abstractNum>
   <w:abstractNum w:abstractNumId="50" w15:restartNumberingAfterBreak="0">
+    <w:nsid w:val="7D370931"/>
+    <w:multiLevelType w:val="multilevel"/>
+    <w:tmpl w:val="7BE4705A"/>
+    <w:lvl w:ilvl="0">
+      <w:start w:val="1"/>
+      <w:numFmt w:val="decimal"/>
+      <w:lvlText w:val="%1."/>
+      <w:lvlJc w:val="left"/>
+      <w:pPr>
+        <w:tabs>
+          <w:tab w:val="num" w:pos="720"/>
+        </w:tabs>
+        <w:ind w:left="720" w:hanging="360"/>
+      </w:pPr>
+    </w:lvl>
+    <w:lvl w:ilvl="1" w:tentative="1">
+      <w:start w:val="1"/>
+      <w:numFmt w:val="decimal"/>
+      <w:lvlText w:val="%2."/>
+      <w:lvlJc w:val="left"/>
+      <w:pPr>
+        <w:tabs>
+          <w:tab w:val="num" w:pos="1440"/>
+        </w:tabs>
+        <w:ind w:left="1440" w:hanging="360"/>
+      </w:pPr>
+    </w:lvl>
+    <w:lvl w:ilvl="2" w:tentative="1">
+      <w:start w:val="1"/>
+      <w:numFmt w:val="decimal"/>
+      <w:lvlText w:val="%3."/>
+      <w:lvlJc w:val="left"/>
+      <w:pPr>
+        <w:tabs>
+          <w:tab w:val="num" w:pos="2160"/>
+        </w:tabs>
+        <w:ind w:left="2160" w:hanging="360"/>
+      </w:pPr>
+    </w:lvl>
+    <w:lvl w:ilvl="3" w:tentative="1">
+      <w:start w:val="1"/>
+      <w:numFmt w:val="decimal"/>
+      <w:lvlText w:val="%4."/>
+      <w:lvlJc w:val="left"/>
+      <w:pPr>
+        <w:tabs>
+          <w:tab w:val="num" w:pos="2880"/>
+        </w:tabs>
+        <w:ind w:left="2880" w:hanging="360"/>
+      </w:pPr>
+    </w:lvl>
+    <w:lvl w:ilvl="4" w:tentative="1">
+      <w:start w:val="1"/>
+      <w:numFmt w:val="decimal"/>
+      <w:lvlText w:val="%5."/>
+      <w:lvlJc w:val="left"/>
+      <w:pPr>
+        <w:tabs>
+          <w:tab w:val="num" w:pos="3600"/>
+        </w:tabs>
+        <w:ind w:left="3600" w:hanging="360"/>
+      </w:pPr>
+    </w:lvl>
+    <w:lvl w:ilvl="5" w:tentative="1">
+      <w:start w:val="1"/>
+      <w:numFmt w:val="decimal"/>
+      <w:lvlText w:val="%6."/>
+      <w:lvlJc w:val="left"/>
+      <w:pPr>
+        <w:tabs>
+          <w:tab w:val="num" w:pos="4320"/>
+        </w:tabs>
+        <w:ind w:left="4320" w:hanging="360"/>
+      </w:pPr>
+    </w:lvl>
+    <w:lvl w:ilvl="6" w:tentative="1">
+      <w:start w:val="1"/>
+      <w:numFmt w:val="decimal"/>
+      <w:lvlText w:val="%7."/>
+      <w:lvlJc w:val="left"/>
+      <w:pPr>
+        <w:tabs>
+          <w:tab w:val="num" w:pos="5040"/>
+        </w:tabs>
+        <w:ind w:left="5040" w:hanging="360"/>
+      </w:pPr>
+    </w:lvl>
+    <w:lvl w:ilvl="7" w:tentative="1">
+      <w:start w:val="1"/>
+      <w:numFmt w:val="decimal"/>
+      <w:lvlText w:val="%8."/>
+      <w:lvlJc w:val="left"/>
+      <w:pPr>
+        <w:tabs>
+          <w:tab w:val="num" w:pos="5760"/>
+        </w:tabs>
+        <w:ind w:left="5760" w:hanging="360"/>
+      </w:pPr>
+    </w:lvl>
+    <w:lvl w:ilvl="8" w:tentative="1">
+      <w:start w:val="1"/>
+      <w:numFmt w:val="decimal"/>
+      <w:lvlText w:val="%9."/>
+      <w:lvlJc w:val="left"/>
+      <w:pPr>
+        <w:tabs>
+          <w:tab w:val="num" w:pos="6480"/>
+        </w:tabs>
+        <w:ind w:left="6480" w:hanging="360"/>
+      </w:pPr>
+    </w:lvl>
+  </w:abstractNum>
+  <w:abstractNum w:abstractNumId="51" w15:restartNumberingAfterBreak="0">
     <w:nsid w:val="7F9A795F"/>
     <w:multiLevelType w:val="hybridMultilevel"/>
     <w:tmpl w:val="B8BA70B0"/>
@@ -9682,7 +9919,7 @@
     <w:abstractNumId w:val="9"/>
   </w:num>
   <w:num w:numId="24" w16cid:durableId="1619295887">
-    <w:abstractNumId w:val="50"/>
+    <w:abstractNumId w:val="51"/>
   </w:num>
   <w:num w:numId="25" w16cid:durableId="207574491">
     <w:abstractNumId w:val="36"/>
@@ -9782,6 +10019,9 @@
   </w:num>
   <w:num w:numId="54" w16cid:durableId="325790912">
     <w:abstractNumId w:val="24"/>
+  </w:num>
+  <w:num w:numId="55" w16cid:durableId="1723940730">
+    <w:abstractNumId w:val="50"/>
   </w:num>
 </w:numbering>
 </file>

</xml_diff>

<commit_message>
CORRECTION : correction algorithme récursif
</commit_message>
<xml_diff>
--- a/08-Algorithme_Trie.docx
+++ b/08-Algorithme_Trie.docx
@@ -1359,6 +1359,7 @@
         </w:rPr>
       </w:pPr>
       <w:proofErr w:type="spellStart"/>
+      <w:proofErr w:type="gramStart"/>
       <w:r>
         <w:rPr>
           <w:b/>
@@ -1367,6 +1368,7 @@
         <w:t>indexMin</w:t>
       </w:r>
       <w:proofErr w:type="spellEnd"/>
+      <w:proofErr w:type="gramEnd"/>
       <w:r>
         <w:rPr>
           <w:b/>
@@ -1561,12 +1563,30 @@
         <w:jc w:val="both"/>
       </w:pPr>
       <w:proofErr w:type="spellStart"/>
+      <w:proofErr w:type="gramStart"/>
       <w:r>
         <w:t>indexMin</w:t>
       </w:r>
       <w:proofErr w:type="spellEnd"/>
-      <w:r>
-        <w:t xml:space="preserve"> est différent de i  ( 1 != 0) =&gt; Echange de valeur entre les case</w:t>
+      <w:proofErr w:type="gramEnd"/>
+      <w:r>
+        <w:t xml:space="preserve"> est différent de </w:t>
+      </w:r>
+      <w:proofErr w:type="gramStart"/>
+      <w:r>
+        <w:t>i  (</w:t>
+      </w:r>
+      <w:proofErr w:type="gramEnd"/>
+      <w:r>
+        <w:t xml:space="preserve"> 1</w:t>
+      </w:r>
+      <w:proofErr w:type="gramStart"/>
+      <w:r>
+        <w:t> !=</w:t>
+      </w:r>
+      <w:proofErr w:type="gramEnd"/>
+      <w:r>
+        <w:t xml:space="preserve"> 0) =&gt; Echange de valeur entre les case</w:t>
       </w:r>
       <w:r>
         <w:t>s</w:t>
@@ -1664,6 +1684,7 @@
         </w:rPr>
       </w:pPr>
       <w:proofErr w:type="spellStart"/>
+      <w:proofErr w:type="gramStart"/>
       <w:r>
         <w:rPr>
           <w:b/>
@@ -1672,6 +1693,7 @@
         <w:t>indexMin</w:t>
       </w:r>
       <w:proofErr w:type="spellEnd"/>
+      <w:proofErr w:type="gramEnd"/>
       <w:r>
         <w:rPr>
           <w:b/>
@@ -1829,12 +1851,22 @@
         <w:jc w:val="both"/>
       </w:pPr>
       <w:proofErr w:type="spellStart"/>
+      <w:proofErr w:type="gramStart"/>
       <w:r>
         <w:t>indexMin</w:t>
       </w:r>
       <w:proofErr w:type="spellEnd"/>
-      <w:r>
-        <w:t xml:space="preserve"> est différent de i (4 != 1) =&gt; Echange de valeur entre les cases</w:t>
+      <w:proofErr w:type="gramEnd"/>
+      <w:r>
+        <w:t xml:space="preserve"> est différent de i (4</w:t>
+      </w:r>
+      <w:proofErr w:type="gramStart"/>
+      <w:r>
+        <w:t> !=</w:t>
+      </w:r>
+      <w:proofErr w:type="gramEnd"/>
+      <w:r>
+        <w:t xml:space="preserve"> 1) =&gt; Echange de valeur entre les cases</w:t>
       </w:r>
     </w:p>
     <w:p>
@@ -1939,6 +1971,7 @@
         </w:rPr>
       </w:pPr>
       <w:proofErr w:type="spellStart"/>
+      <w:proofErr w:type="gramStart"/>
       <w:r>
         <w:rPr>
           <w:b/>
@@ -1947,6 +1980,7 @@
         <w:t>indexMin</w:t>
       </w:r>
       <w:proofErr w:type="spellEnd"/>
+      <w:proofErr w:type="gramEnd"/>
       <w:r>
         <w:rPr>
           <w:b/>
@@ -2064,10 +2098,12 @@
         <w:jc w:val="both"/>
       </w:pPr>
       <w:proofErr w:type="spellStart"/>
+      <w:proofErr w:type="gramStart"/>
       <w:r>
         <w:t>indexMin</w:t>
       </w:r>
       <w:proofErr w:type="spellEnd"/>
+      <w:proofErr w:type="gramEnd"/>
       <w:r>
         <w:t xml:space="preserve"> est égal à i (</w:t>
       </w:r>
@@ -2190,6 +2226,7 @@
         </w:rPr>
       </w:pPr>
       <w:proofErr w:type="spellStart"/>
+      <w:proofErr w:type="gramStart"/>
       <w:r>
         <w:rPr>
           <w:b/>
@@ -2198,6 +2235,7 @@
         <w:t>indexMin</w:t>
       </w:r>
       <w:proofErr w:type="spellEnd"/>
+      <w:proofErr w:type="gramEnd"/>
       <w:r>
         <w:rPr>
           <w:b/>
@@ -2284,12 +2322,22 @@
         <w:jc w:val="both"/>
       </w:pPr>
       <w:proofErr w:type="spellStart"/>
+      <w:proofErr w:type="gramStart"/>
       <w:r>
         <w:t>indexMin</w:t>
       </w:r>
       <w:proofErr w:type="spellEnd"/>
-      <w:r>
-        <w:t xml:space="preserve"> est différent de i (5 != 3) =&gt; Echange entre les valeurs des cases</w:t>
+      <w:proofErr w:type="gramEnd"/>
+      <w:r>
+        <w:t xml:space="preserve"> est différent de i (5</w:t>
+      </w:r>
+      <w:proofErr w:type="gramStart"/>
+      <w:r>
+        <w:t> !=</w:t>
+      </w:r>
+      <w:proofErr w:type="gramEnd"/>
+      <w:r>
+        <w:t xml:space="preserve"> 3) =&gt; Echange entre les valeurs des cases</w:t>
       </w:r>
     </w:p>
     <w:p>
@@ -2422,6 +2470,7 @@
         </w:rPr>
       </w:pPr>
       <w:proofErr w:type="spellStart"/>
+      <w:proofErr w:type="gramStart"/>
       <w:r>
         <w:rPr>
           <w:b/>
@@ -2430,6 +2479,7 @@
         <w:t>indexMin</w:t>
       </w:r>
       <w:proofErr w:type="spellEnd"/>
+      <w:proofErr w:type="gramEnd"/>
       <w:r>
         <w:rPr>
           <w:b/>
@@ -2485,10 +2535,12 @@
         <w:jc w:val="both"/>
       </w:pPr>
       <w:proofErr w:type="spellStart"/>
+      <w:proofErr w:type="gramStart"/>
       <w:r>
         <w:t>indexMin</w:t>
       </w:r>
       <w:proofErr w:type="spellEnd"/>
+      <w:proofErr w:type="gramEnd"/>
       <w:r>
         <w:t xml:space="preserve"> est égal à i (4 == 4) =&gt; Pas d’Echange entre les valeurs des cases</w:t>
       </w:r>
@@ -2643,7 +2695,15 @@
         <w:pStyle w:val="Code"/>
       </w:pPr>
       <w:r>
-        <w:t xml:space="preserve">     tab &lt;- </w:t>
+        <w:t xml:space="preserve">     </w:t>
+      </w:r>
+      <w:proofErr w:type="gramStart"/>
+      <w:r>
+        <w:t>tab</w:t>
+      </w:r>
+      <w:proofErr w:type="gramEnd"/>
+      <w:r>
+        <w:t xml:space="preserve"> &lt;- </w:t>
       </w:r>
       <w:r>
         <w:t>[45, 12, 89, 23, 67, 34, 5, 78]</w:t>
@@ -2682,10 +2742,12 @@
         <w:t xml:space="preserve">        </w:t>
       </w:r>
       <w:proofErr w:type="spellStart"/>
+      <w:proofErr w:type="gramStart"/>
       <w:r>
         <w:t>indexMin</w:t>
       </w:r>
       <w:proofErr w:type="spellEnd"/>
+      <w:proofErr w:type="gramEnd"/>
       <w:r>
         <w:t xml:space="preserve"> &lt;- i</w:t>
       </w:r>
@@ -2722,10 +2784,12 @@
         <w:t xml:space="preserve">             </w:t>
       </w:r>
       <w:proofErr w:type="spellStart"/>
+      <w:proofErr w:type="gramStart"/>
       <w:r>
         <w:t>indexMin</w:t>
       </w:r>
       <w:proofErr w:type="spellEnd"/>
+      <w:proofErr w:type="gramEnd"/>
       <w:r>
         <w:t xml:space="preserve"> &lt;- j</w:t>
       </w:r>
@@ -2770,7 +2834,15 @@
         <w:pStyle w:val="Code"/>
       </w:pPr>
       <w:r>
-        <w:t xml:space="preserve">      temp &lt;- tab[</w:t>
+        <w:t xml:space="preserve">      </w:t>
+      </w:r>
+      <w:proofErr w:type="gramStart"/>
+      <w:r>
+        <w:t>temp</w:t>
+      </w:r>
+      <w:proofErr w:type="gramEnd"/>
+      <w:r>
+        <w:t xml:space="preserve"> &lt;- tab[</w:t>
       </w:r>
       <w:proofErr w:type="spellStart"/>
       <w:r>
@@ -2786,7 +2858,15 @@
         <w:pStyle w:val="Code"/>
       </w:pPr>
       <w:r>
-        <w:t xml:space="preserve">      tab[</w:t>
+        <w:t xml:space="preserve">      </w:t>
+      </w:r>
+      <w:proofErr w:type="gramStart"/>
+      <w:r>
+        <w:t>tab</w:t>
+      </w:r>
+      <w:proofErr w:type="gramEnd"/>
+      <w:r>
+        <w:t>[</w:t>
       </w:r>
       <w:proofErr w:type="spellStart"/>
       <w:r>
@@ -2802,7 +2882,15 @@
         <w:pStyle w:val="Code"/>
       </w:pPr>
       <w:r>
-        <w:t xml:space="preserve">      tab[i] &lt;- temp</w:t>
+        <w:t xml:space="preserve">      </w:t>
+      </w:r>
+      <w:proofErr w:type="gramStart"/>
+      <w:r>
+        <w:t>tab</w:t>
+      </w:r>
+      <w:proofErr w:type="gramEnd"/>
+      <w:r>
+        <w:t>[i] &lt;- temp</w:t>
       </w:r>
     </w:p>
     <w:p>
@@ -2891,7 +2979,15 @@
         <w:pStyle w:val="Code"/>
       </w:pPr>
       <w:r>
-        <w:t xml:space="preserve">       temp &lt;- tab[</w:t>
+        <w:t xml:space="preserve">       </w:t>
+      </w:r>
+      <w:proofErr w:type="gramStart"/>
+      <w:r>
+        <w:t>temp</w:t>
+      </w:r>
+      <w:proofErr w:type="gramEnd"/>
+      <w:r>
+        <w:t xml:space="preserve"> &lt;- tab[</w:t>
       </w:r>
       <w:r>
         <w:t>j</w:t>
@@ -2910,221 +3006,267 @@
       <w:r>
         <w:t xml:space="preserve">    </w:t>
       </w:r>
-      <w:r>
+      <w:proofErr w:type="gramStart"/>
+      <w:r>
+        <w:t>tab</w:t>
+      </w:r>
+      <w:proofErr w:type="gramEnd"/>
+      <w:r>
+        <w:t>[</w:t>
+      </w:r>
+      <w:r>
+        <w:t>j</w:t>
+      </w:r>
+      <w:r>
+        <w:t>] &lt;- tab[</w:t>
+      </w:r>
+      <w:r>
+        <w:t>j+1</w:t>
+      </w:r>
+      <w:r>
+        <w:t>]</w:t>
+      </w:r>
+    </w:p>
+    <w:p>
+      <w:pPr>
+        <w:pStyle w:val="Code"/>
+      </w:pPr>
+      <w:r>
+        <w:t xml:space="preserve">      </w:t>
+      </w:r>
+      <w:r>
+        <w:t xml:space="preserve"> </w:t>
+      </w:r>
+      <w:proofErr w:type="gramStart"/>
+      <w:r>
+        <w:t>tab</w:t>
+      </w:r>
+      <w:proofErr w:type="gramEnd"/>
+      <w:r>
+        <w:t>[</w:t>
+      </w:r>
+      <w:r>
+        <w:t>j+1</w:t>
+      </w:r>
+      <w:r>
+        <w:t>] &lt;- temp</w:t>
+      </w:r>
+    </w:p>
+    <w:p>
+      <w:pPr>
+        <w:pStyle w:val="Code"/>
+      </w:pPr>
+      <w:r>
+        <w:t xml:space="preserve">     FIN SI</w:t>
+      </w:r>
+    </w:p>
+    <w:p>
+      <w:pPr>
+        <w:pStyle w:val="Code"/>
+      </w:pPr>
+      <w:r>
+        <w:t xml:space="preserve">  FIN POUR</w:t>
+      </w:r>
+    </w:p>
+    <w:p>
+      <w:pPr>
+        <w:pStyle w:val="Code"/>
+      </w:pPr>
+      <w:r>
+        <w:t>FIN POUR</w:t>
+      </w:r>
+      <w:r>
+        <w:br/>
+      </w:r>
+      <w:r>
+        <w:br/>
+      </w:r>
+    </w:p>
+    <w:p>
+      <w:pPr>
+        <w:pStyle w:val="Code"/>
+      </w:pPr>
+      <w:r>
+        <w:rPr>
+          <w:color w:val="EE0000"/>
+        </w:rPr>
+        <w:t>//TRACAGE DE LA RECHERCHE DICHOTOMIQUE</w:t>
+      </w:r>
+    </w:p>
+    <w:p>
+      <w:pPr>
+        <w:pStyle w:val="Code"/>
+        <w:rPr>
+          <w:color w:val="auto"/>
+        </w:rPr>
+      </w:pPr>
+      <w:r>
+        <w:rPr>
+          <w:b/>
+          <w:bCs/>
+          <w:color w:val="auto"/>
+        </w:rPr>
+        <w:t>Tab trié =</w:t>
+      </w:r>
+      <w:r>
+        <w:rPr>
+          <w:b/>
+          <w:bCs/>
+          <w:color w:val="auto"/>
+        </w:rPr>
+        <w:t xml:space="preserve"> </w:t>
+      </w:r>
+      <w:r>
+        <w:t>[</w:t>
+      </w:r>
+      <w:r>
+        <w:t>5,12,23,34,</w:t>
+      </w:r>
+      <w:r>
+        <w:t>45,</w:t>
+      </w:r>
+      <w:r>
+        <w:t>67,78,</w:t>
+      </w:r>
+      <w:r>
+        <w:t>89]</w:t>
+      </w:r>
+      <w:r>
+        <w:br/>
+      </w:r>
+    </w:p>
+    <w:p>
+      <w:pPr>
+        <w:pStyle w:val="Code"/>
+        <w:rPr>
+          <w:color w:val="auto"/>
+        </w:rPr>
+      </w:pPr>
+      <w:r>
+        <w:rPr>
+          <w:b/>
+          <w:bCs/>
+          <w:color w:val="auto"/>
+        </w:rPr>
+        <w:t>TOUR 1 :</w:t>
+      </w:r>
+    </w:p>
+    <w:p>
+      <w:pPr>
+        <w:pStyle w:val="Code"/>
+        <w:rPr>
+          <w:color w:val="auto"/>
+        </w:rPr>
+      </w:pPr>
+      <w:proofErr w:type="spellStart"/>
+      <w:proofErr w:type="gramStart"/>
+      <w:r>
+        <w:rPr>
+          <w:b/>
+          <w:bCs/>
+          <w:color w:val="auto"/>
+        </w:rPr>
+        <w:t>indexDebut</w:t>
+      </w:r>
+      <w:proofErr w:type="spellEnd"/>
+      <w:proofErr w:type="gramEnd"/>
+      <w:r>
+        <w:rPr>
+          <w:b/>
+          <w:bCs/>
+          <w:color w:val="auto"/>
+        </w:rPr>
+        <w:t xml:space="preserve"> = 0</w:t>
+      </w:r>
+    </w:p>
+    <w:p>
+      <w:pPr>
+        <w:pStyle w:val="Code"/>
+        <w:rPr>
+          <w:color w:val="auto"/>
+        </w:rPr>
+      </w:pPr>
+      <w:proofErr w:type="spellStart"/>
+      <w:proofErr w:type="gramStart"/>
+      <w:r>
+        <w:rPr>
+          <w:b/>
+          <w:bCs/>
+          <w:color w:val="auto"/>
+        </w:rPr>
+        <w:t>indexFin</w:t>
+      </w:r>
+      <w:proofErr w:type="spellEnd"/>
+      <w:proofErr w:type="gramEnd"/>
+      <w:r>
+        <w:rPr>
+          <w:b/>
+          <w:bCs/>
+          <w:color w:val="auto"/>
+        </w:rPr>
+        <w:t xml:space="preserve"> = 7</w:t>
+      </w:r>
+    </w:p>
+    <w:p>
+      <w:pPr>
+        <w:pStyle w:val="Code"/>
+        <w:rPr>
+          <w:color w:val="auto"/>
+        </w:rPr>
+      </w:pPr>
+      <w:proofErr w:type="gramStart"/>
+      <w:r>
+        <w:rPr>
+          <w:b/>
+          <w:bCs/>
+          <w:color w:val="auto"/>
+        </w:rPr>
+        <w:t>milieu</w:t>
+      </w:r>
+      <w:proofErr w:type="gramEnd"/>
+      <w:r>
+        <w:rPr>
+          <w:b/>
+          <w:bCs/>
+          <w:color w:val="auto"/>
+        </w:rPr>
+        <w:t xml:space="preserve"> = 3</w:t>
+      </w:r>
+    </w:p>
+    <w:p>
+      <w:pPr>
+        <w:pStyle w:val="Code"/>
+        <w:rPr>
+          <w:color w:val="auto"/>
+        </w:rPr>
+      </w:pPr>
+      <w:proofErr w:type="gramStart"/>
+      <w:r>
+        <w:rPr>
+          <w:color w:val="auto"/>
+        </w:rPr>
+        <w:t>comparer</w:t>
+      </w:r>
+      <w:proofErr w:type="gramEnd"/>
+      <w:r>
+        <w:rPr>
+          <w:color w:val="auto"/>
+        </w:rPr>
+        <w:t xml:space="preserve"> </w:t>
+      </w:r>
+      <w:proofErr w:type="gramStart"/>
+      <w:r>
+        <w:rPr>
+          <w:color w:val="auto"/>
+        </w:rPr>
         <w:t>tab[</w:t>
       </w:r>
-      <w:r>
-        <w:t>j</w:t>
-      </w:r>
-      <w:r>
-        <w:t>] &lt;- tab[</w:t>
-      </w:r>
-      <w:r>
-        <w:t>j+1</w:t>
-      </w:r>
-      <w:r>
-        <w:t>]</w:t>
-      </w:r>
-    </w:p>
-    <w:p>
-      <w:pPr>
-        <w:pStyle w:val="Code"/>
-      </w:pPr>
-      <w:r>
-        <w:t xml:space="preserve">      </w:t>
-      </w:r>
-      <w:r>
-        <w:t xml:space="preserve"> </w:t>
-      </w:r>
-      <w:r>
-        <w:t>tab[</w:t>
-      </w:r>
-      <w:r>
-        <w:t>j+1</w:t>
-      </w:r>
-      <w:r>
-        <w:t>] &lt;- temp</w:t>
-      </w:r>
-    </w:p>
-    <w:p>
-      <w:pPr>
-        <w:pStyle w:val="Code"/>
-      </w:pPr>
-      <w:r>
-        <w:t xml:space="preserve">     FIN SI</w:t>
-      </w:r>
-    </w:p>
-    <w:p>
-      <w:pPr>
-        <w:pStyle w:val="Code"/>
-      </w:pPr>
-      <w:r>
-        <w:t xml:space="preserve">  FIN POUR</w:t>
-      </w:r>
-    </w:p>
-    <w:p>
-      <w:pPr>
-        <w:pStyle w:val="Code"/>
-      </w:pPr>
-      <w:r>
-        <w:t>FIN POUR</w:t>
-      </w:r>
-      <w:r>
-        <w:br/>
-      </w:r>
-      <w:r>
-        <w:br/>
-      </w:r>
-    </w:p>
-    <w:p>
-      <w:pPr>
-        <w:pStyle w:val="Code"/>
-      </w:pPr>
-      <w:r>
-        <w:rPr>
-          <w:color w:val="EE0000"/>
-        </w:rPr>
-        <w:t>//TRACAGE DE LA RECHERCHE DICHOTOMIQUE</w:t>
-      </w:r>
-    </w:p>
-    <w:p>
-      <w:pPr>
-        <w:pStyle w:val="Code"/>
+      <w:proofErr w:type="gramEnd"/>
+      <w:r>
         <w:rPr>
           <w:color w:val="auto"/>
         </w:rPr>
-      </w:pPr>
-      <w:r>
-        <w:rPr>
-          <w:b/>
-          <w:bCs/>
-          <w:color w:val="auto"/>
-        </w:rPr>
-        <w:t>Tab trié =</w:t>
-      </w:r>
-      <w:r>
-        <w:rPr>
-          <w:b/>
-          <w:bCs/>
-          <w:color w:val="auto"/>
-        </w:rPr>
-        <w:t xml:space="preserve"> </w:t>
-      </w:r>
-      <w:r>
-        <w:t>[</w:t>
-      </w:r>
-      <w:r>
-        <w:t>5,12,23,34,</w:t>
-      </w:r>
-      <w:r>
-        <w:t>45,</w:t>
-      </w:r>
-      <w:r>
-        <w:t>67,78,</w:t>
-      </w:r>
-      <w:r>
-        <w:t>89]</w:t>
-      </w:r>
-      <w:r>
-        <w:br/>
-      </w:r>
-    </w:p>
-    <w:p>
-      <w:pPr>
-        <w:pStyle w:val="Code"/>
-        <w:rPr>
-          <w:color w:val="auto"/>
-        </w:rPr>
-      </w:pPr>
-      <w:r>
-        <w:rPr>
-          <w:b/>
-          <w:bCs/>
-          <w:color w:val="auto"/>
-        </w:rPr>
-        <w:t>TOUR 1 :</w:t>
-      </w:r>
-    </w:p>
-    <w:p>
-      <w:pPr>
-        <w:pStyle w:val="Code"/>
-        <w:rPr>
-          <w:color w:val="auto"/>
-        </w:rPr>
-      </w:pPr>
-      <w:proofErr w:type="spellStart"/>
-      <w:r>
-        <w:rPr>
-          <w:b/>
-          <w:bCs/>
-          <w:color w:val="auto"/>
-        </w:rPr>
-        <w:t>indexDebut</w:t>
-      </w:r>
-      <w:proofErr w:type="spellEnd"/>
-      <w:r>
-        <w:rPr>
-          <w:b/>
-          <w:bCs/>
-          <w:color w:val="auto"/>
-        </w:rPr>
-        <w:t xml:space="preserve"> = 0</w:t>
-      </w:r>
-    </w:p>
-    <w:p>
-      <w:pPr>
-        <w:pStyle w:val="Code"/>
-        <w:rPr>
-          <w:color w:val="auto"/>
-        </w:rPr>
-      </w:pPr>
-      <w:proofErr w:type="spellStart"/>
-      <w:r>
-        <w:rPr>
-          <w:b/>
-          <w:bCs/>
-          <w:color w:val="auto"/>
-        </w:rPr>
-        <w:t>indexFin</w:t>
-      </w:r>
-      <w:proofErr w:type="spellEnd"/>
-      <w:r>
-        <w:rPr>
-          <w:b/>
-          <w:bCs/>
-          <w:color w:val="auto"/>
-        </w:rPr>
-        <w:t xml:space="preserve"> = 7</w:t>
-      </w:r>
-    </w:p>
-    <w:p>
-      <w:pPr>
-        <w:pStyle w:val="Code"/>
-        <w:rPr>
-          <w:color w:val="auto"/>
-        </w:rPr>
-      </w:pPr>
-      <w:r>
-        <w:rPr>
-          <w:b/>
-          <w:bCs/>
-          <w:color w:val="auto"/>
-        </w:rPr>
-        <w:t>milieu = 3</w:t>
-      </w:r>
-    </w:p>
-    <w:p>
-      <w:pPr>
-        <w:pStyle w:val="Code"/>
-        <w:rPr>
-          <w:color w:val="auto"/>
-        </w:rPr>
-      </w:pPr>
-      <w:r>
-        <w:rPr>
-          <w:color w:val="auto"/>
-        </w:rPr>
-        <w:t>comparer tab[3] (34) avec le nombre 67</w:t>
+        <w:t>3] (34) avec le nombre 67</w:t>
       </w:r>
     </w:p>
     <w:p>
@@ -3190,6 +3332,7 @@
         </w:rPr>
       </w:pPr>
       <w:proofErr w:type="spellStart"/>
+      <w:proofErr w:type="gramStart"/>
       <w:r>
         <w:rPr>
           <w:b/>
@@ -3199,6 +3342,7 @@
         <w:t>indexDebut</w:t>
       </w:r>
       <w:proofErr w:type="spellEnd"/>
+      <w:proofErr w:type="gramEnd"/>
       <w:r>
         <w:rPr>
           <w:b/>
@@ -3216,6 +3360,7 @@
         </w:rPr>
       </w:pPr>
       <w:proofErr w:type="spellStart"/>
+      <w:proofErr w:type="gramStart"/>
       <w:r>
         <w:rPr>
           <w:b/>
@@ -3225,6 +3370,7 @@
         <w:t>indexFin</w:t>
       </w:r>
       <w:proofErr w:type="spellEnd"/>
+      <w:proofErr w:type="gramEnd"/>
       <w:r>
         <w:rPr>
           <w:b/>
@@ -3241,13 +3387,41 @@
           <w:color w:val="auto"/>
         </w:rPr>
       </w:pPr>
+      <w:proofErr w:type="gramStart"/>
       <w:r>
         <w:rPr>
           <w:b/>
           <w:bCs/>
           <w:color w:val="auto"/>
         </w:rPr>
-        <w:t>milieu = (4+7)/2 = 11/2 = 5</w:t>
+        <w:t>milieu</w:t>
+      </w:r>
+      <w:proofErr w:type="gramEnd"/>
+      <w:r>
+        <w:rPr>
+          <w:b/>
+          <w:bCs/>
+          <w:color w:val="auto"/>
+        </w:rPr>
+        <w:t xml:space="preserve"> = (4+</w:t>
+      </w:r>
+      <w:proofErr w:type="gramStart"/>
+      <w:r>
+        <w:rPr>
+          <w:b/>
+          <w:bCs/>
+          <w:color w:val="auto"/>
+        </w:rPr>
+        <w:t>7)/</w:t>
+      </w:r>
+      <w:proofErr w:type="gramEnd"/>
+      <w:r>
+        <w:rPr>
+          <w:b/>
+          <w:bCs/>
+          <w:color w:val="auto"/>
+        </w:rPr>
+        <w:t>2 = 11/2 = 5</w:t>
       </w:r>
     </w:p>
     <w:p>
@@ -3257,11 +3431,33 @@
           <w:color w:val="auto"/>
         </w:rPr>
       </w:pPr>
+      <w:proofErr w:type="gramStart"/>
       <w:r>
         <w:rPr>
           <w:color w:val="auto"/>
         </w:rPr>
-        <w:t>comparer tab[5] (67) à 67</w:t>
+        <w:t>comparer</w:t>
+      </w:r>
+      <w:proofErr w:type="gramEnd"/>
+      <w:r>
+        <w:rPr>
+          <w:color w:val="auto"/>
+        </w:rPr>
+        <w:t xml:space="preserve"> </w:t>
+      </w:r>
+      <w:proofErr w:type="gramStart"/>
+      <w:r>
+        <w:rPr>
+          <w:color w:val="auto"/>
+        </w:rPr>
+        <w:t>tab[</w:t>
+      </w:r>
+      <w:proofErr w:type="gramEnd"/>
+      <w:r>
+        <w:rPr>
+          <w:color w:val="auto"/>
+        </w:rPr>
+        <w:t>5] (67) à 67</w:t>
       </w:r>
     </w:p>
     <w:p>

</xml_diff>